<commit_message>
Numery uprawnien SEP Tomasza na stale w szablonach (G1/E/470/1081/2025, G1/D/470/1082/2025); przegenerowane wszystkie wystawione pisma
Co-Authored-By: Claude Opus 5 <noreply@anthropic.com>
Claude-Session: https://claude.ai/code/session_01M5iVB9VJysDwqNR2wVQ83a
</commit_message>
<xml_diff>
--- a/dokumenty/elektryk/wystawione/Oswiadczenie_dzialka_23_Zachariasz.docx
+++ b/dokumenty/elektryk/wystawione/Oswiadczenie_dzialka_23_Zachariasz.docx
@@ -324,26 +324,12 @@
       <w:r>
         <w:rPr>
           <w:rFonts w:ascii="Calibri" w:cs="Calibri" w:eastAsia="Calibri" w:hAnsi="Calibri"/>
-          <w:sz w:val="22"/>
-          <w:szCs w:val="22"/>
-        </w:rPr>
-        <w:t xml:space="preserve">……………………………</w:t>
-      </w:r>
-      <w:r>
-        <w:rPr>
-          <w:rFonts w:ascii="Calibri" w:cs="Calibri" w:eastAsia="Calibri" w:hAnsi="Calibri"/>
-          <w:sz w:val="22"/>
-          <w:szCs w:val="22"/>
-        </w:rPr>
-        <w:t xml:space="preserve">, ważne do dnia </w:t>
-      </w:r>
-      <w:r>
-        <w:rPr>
-          <w:rFonts w:ascii="Calibri" w:cs="Calibri" w:eastAsia="Calibri" w:hAnsi="Calibri"/>
-          <w:sz w:val="22"/>
-          <w:szCs w:val="22"/>
-        </w:rPr>
-        <w:t xml:space="preserve">………………………</w:t>
+          <w:b/>
+          <w:bCs/>
+          <w:sz w:val="22"/>
+          <w:szCs w:val="22"/>
+        </w:rPr>
+        <w:t xml:space="preserve">G1/E/470/1081/2025</w:t>
       </w:r>
       <w:r>
         <w:rPr>
@@ -373,26 +359,12 @@
       <w:r>
         <w:rPr>
           <w:rFonts w:ascii="Calibri" w:cs="Calibri" w:eastAsia="Calibri" w:hAnsi="Calibri"/>
-          <w:sz w:val="22"/>
-          <w:szCs w:val="22"/>
-        </w:rPr>
-        <w:t xml:space="preserve">……………………………</w:t>
-      </w:r>
-      <w:r>
-        <w:rPr>
-          <w:rFonts w:ascii="Calibri" w:cs="Calibri" w:eastAsia="Calibri" w:hAnsi="Calibri"/>
-          <w:sz w:val="22"/>
-          <w:szCs w:val="22"/>
-        </w:rPr>
-        <w:t xml:space="preserve">, ważne do dnia </w:t>
-      </w:r>
-      <w:r>
-        <w:rPr>
-          <w:rFonts w:ascii="Calibri" w:cs="Calibri" w:eastAsia="Calibri" w:hAnsi="Calibri"/>
-          <w:sz w:val="22"/>
-          <w:szCs w:val="22"/>
-        </w:rPr>
-        <w:t xml:space="preserve">………………………</w:t>
+          <w:b/>
+          <w:bCs/>
+          <w:sz w:val="22"/>
+          <w:szCs w:val="22"/>
+        </w:rPr>
+        <w:t xml:space="preserve">G1/D/470/1082/2025</w:t>
       </w:r>
       <w:r>
         <w:rPr>

</xml_diff>

<commit_message>
cleanup: filmy opublikowane na NAS, usunięte z repo; aktualizacja logów runtime
</commit_message>
<xml_diff>
--- a/dokumenty/elektryk/wystawione/Oswiadczenie_dzialka_23_Zachariasz.docx
+++ b/dokumenty/elektryk/wystawione/Oswiadczenie_dzialka_23_Zachariasz.docx
@@ -229,7 +229,7 @@
     </w:p>
     <w:p>
       <w:pPr>
-        <w:spacing w:after="260"/>
+        <w:spacing w:after="160"/>
         <w:jc w:val="right"/>
       </w:pPr>
       <w:r>
@@ -259,7 +259,7 @@
     </w:p>
     <w:p>
       <w:pPr>
-        <w:spacing w:after="300"/>
+        <w:spacing w:after="180"/>
         <w:jc w:val="center"/>
       </w:pPr>
       <w:r>
@@ -342,7 +342,7 @@
     </w:p>
     <w:p>
       <w:pPr>
-        <w:spacing w:after="200"/>
+        <w:spacing w:after="140"/>
         <w:ind w:left="360"/>
         <w:jc w:val="left"/>
       </w:pPr>
@@ -377,7 +377,7 @@
     </w:p>
     <w:p>
       <w:pPr>
-        <w:spacing w:after="240"/>
+        <w:spacing w:after="160"/>
         <w:jc w:val="both"/>
       </w:pPr>
       <w:r>
@@ -450,7 +450,7 @@
           <w:ilvl w:val="0"/>
           <w:numId w:val="2"/>
         </w:numPr>
-        <w:spacing w:after="160" w:line="300"/>
+        <w:spacing w:after="110" w:line="270"/>
         <w:jc w:val="both"/>
       </w:pPr>
       <w:r>
@@ -469,7 +469,7 @@
           <w:ilvl w:val="0"/>
           <w:numId w:val="2"/>
         </w:numPr>
-        <w:spacing w:after="160" w:line="300"/>
+        <w:spacing w:after="110" w:line="270"/>
         <w:jc w:val="both"/>
       </w:pPr>
       <w:r>
@@ -506,6 +506,24 @@
           <w:sz w:val="22"/>
           <w:szCs w:val="22"/>
         </w:rPr>
+        <w:t xml:space="preserve">17 377,5 kWh</w:t>
+      </w:r>
+      <w:r>
+        <w:rPr>
+          <w:rFonts w:ascii="Calibri" w:cs="Calibri" w:eastAsia="Calibri" w:hAnsi="Calibri"/>
+          <w:sz w:val="22"/>
+          <w:szCs w:val="22"/>
+        </w:rPr>
+        <w:t xml:space="preserve">; do rozliczenia końcowego z Zarządem ROD przyjęto </w:t>
+      </w:r>
+      <w:r>
+        <w:rPr>
+          <w:rFonts w:ascii="Calibri" w:cs="Calibri" w:eastAsia="Calibri" w:hAnsi="Calibri"/>
+          <w:b/>
+          <w:bCs/>
+          <w:sz w:val="22"/>
+          <w:szCs w:val="22"/>
+        </w:rPr>
         <w:t xml:space="preserve">17 378 kWh</w:t>
       </w:r>
       <w:r>
@@ -514,7 +532,7 @@
           <w:sz w:val="22"/>
           <w:szCs w:val="22"/>
         </w:rPr>
-        <w:t xml:space="preserve"> — do rozliczenia końcowego z Zarządem ROD;</w:t>
+        <w:t xml:space="preserve"> (zaokrąglenie w górę do pełnej kWh);</w:t>
       </w:r>
     </w:p>
     <w:p>
@@ -524,7 +542,7 @@
           <w:ilvl w:val="0"/>
           <w:numId w:val="2"/>
         </w:numPr>
-        <w:spacing w:after="160" w:line="300"/>
+        <w:spacing w:after="110" w:line="270"/>
         <w:jc w:val="both"/>
       </w:pPr>
       <w:r>
@@ -543,7 +561,7 @@
           <w:ilvl w:val="0"/>
           <w:numId w:val="2"/>
         </w:numPr>
-        <w:spacing w:after="160" w:line="300"/>
+        <w:spacing w:after="110" w:line="270"/>
         <w:jc w:val="both"/>
       </w:pPr>
       <w:r>
@@ -562,7 +580,7 @@
           <w:ilvl w:val="0"/>
           <w:numId w:val="2"/>
         </w:numPr>
-        <w:spacing w:after="300"/>
+        <w:spacing w:after="180"/>
         <w:jc w:val="both"/>
       </w:pPr>
       <w:r>
@@ -576,7 +594,35 @@
     </w:p>
     <w:p>
       <w:pPr>
-        <w:spacing w:after="700"/>
+        <w:pBdr>
+          <w:left w:val="single" w:color="1F5130" w:sz="18" w:space="6"/>
+        </w:pBdr>
+        <w:spacing w:after="160" w:before="0" w:line="260"/>
+        <w:ind w:left="120"/>
+        <w:jc w:val="both"/>
+      </w:pPr>
+      <w:r>
+        <w:rPr>
+          <w:rFonts w:ascii="Calibri" w:cs="Calibri" w:eastAsia="Calibri" w:hAnsi="Calibri"/>
+          <w:b/>
+          <w:bCs/>
+          <w:sz w:val="20"/>
+          <w:szCs w:val="20"/>
+        </w:rPr>
+        <w:t xml:space="preserve">Granica odpowiedzialności: </w:t>
+      </w:r>
+      <w:r>
+        <w:rPr>
+          <w:rFonts w:ascii="Calibri" w:cs="Calibri" w:eastAsia="Calibri" w:hAnsi="Calibri"/>
+          <w:sz w:val="20"/>
+          <w:szCs w:val="20"/>
+        </w:rPr>
+        <w:t xml:space="preserve">odpowiadam wyłącznie za prace opisane w niniejszym oświadczeniu, tj. do punktu przyłączenia instalacji działki w miejscu przełączenia zasilania. Instalacja elektryczna za tym punktem — na terenie działki, w tym w altanie — nie była przedmiotem prac; za jej stan techniczny, eksploatację i bezpieczeństwo użytkowania odpowiada użytkownik (dzierżawca) działki.</w:t>
+      </w:r>
+    </w:p>
+    <w:p>
+      <w:pPr>
+        <w:spacing w:after="520"/>
         <w:jc w:val="both"/>
       </w:pPr>
       <w:r>
@@ -673,7 +719,7 @@
     </w:p>
     <w:sectPr>
       <w:pgSz w:w="11906" w:h="16838" w:orient="portrait"/>
-      <w:pgMar w:top="1000" w:right="1418" w:bottom="1134" w:left="1418" w:header="708" w:footer="708" w:gutter="0"/>
+      <w:pgMar w:top="760" w:right="1300" w:bottom="760" w:left="1300" w:header="708" w:footer="708" w:gutter="0"/>
       <w:pgNumType/>
       <w:docGrid w:linePitch="360"/>
     </w:sectPr>

</xml_diff>